<commit_message>
them cong ty co phan
</commit_message>
<xml_diff>
--- a/assets/2 thành viên/02. Giấy đề nghị.docx
+++ b/assets/2 thành viên/02. Giấy đề nghị.docx
@@ -1183,7 +1183,14 @@
           <w:rFonts w:ascii="Times New Roman" w:hAnsi="Times New Roman" w:cs="Times New Roman"/>
           <w:lang w:val="en-US"/>
         </w:rPr>
-        <w:t>: ……………</w:t>
+        <w:t xml:space="preserve">: </w:t>
+      </w:r>
+      <w:r>
+        <w:rPr>
+          <w:rFonts w:ascii="Times New Roman" w:hAnsi="Times New Roman" w:cs="Times New Roman"/>
+          <w:lang w:val="en-US"/>
+        </w:rPr>
+        <w:t>{email}</w:t>
       </w:r>
     </w:p>
     <w:bookmarkEnd w:id="2"/>
@@ -3124,6 +3131,9 @@
               </w:rPr>
             </w:pPr>
             <w:r>
+              <w:rPr>
+                <w:rFonts w:ascii="Times New Roman" w:hAnsi="Times New Roman" w:cs="Times New Roman"/>
+              </w:rPr>
               <w:t>{#nganh_nghe}{stt}</w:t>
             </w:r>
           </w:p>
@@ -3149,6 +3159,9 @@
               </w:rPr>
             </w:pPr>
             <w:r>
+              <w:rPr>
+                <w:rFonts w:ascii="Times New Roman" w:hAnsi="Times New Roman" w:cs="Times New Roman"/>
+              </w:rPr>
               <w:t>{ten_nganh}</w:t>
             </w:r>
           </w:p>
@@ -3175,6 +3188,9 @@
               </w:rPr>
             </w:pPr>
             <w:r>
+              <w:rPr>
+                <w:rFonts w:ascii="Times New Roman" w:hAnsi="Times New Roman" w:cs="Times New Roman"/>
+              </w:rPr>
               <w:t>{ma_nganh}</w:t>
             </w:r>
           </w:p>
@@ -3204,6 +3220,9 @@
               </w:rPr>
             </w:pPr>
             <w:r>
+              <w:rPr>
+                <w:rFonts w:ascii="Times New Roman" w:hAnsi="Times New Roman" w:cs="Times New Roman"/>
+              </w:rPr>
               <w:t>{nganh_chinh}{/nganh_nghe}</w:t>
             </w:r>
           </w:p>
@@ -4918,7 +4937,6 @@
           <w:sz w:val="24"/>
           <w:szCs w:val="24"/>
         </w:rPr>
-        <w:lastRenderedPageBreak/>
         <w:t>Số</w:t>
       </w:r>
       <w:r>
@@ -5101,6 +5119,7 @@
         <w:rPr>
           <w:rFonts w:ascii="Times New Roman" w:hAnsi="Times New Roman" w:cs="Times New Roman"/>
         </w:rPr>
+        <w:lastRenderedPageBreak/>
         <w:t>Địa chỉ liên lạc (chỉ kê khai nếu người đăng ký doanh nghiệp là người đại diện theo pháp luật):</w:t>
       </w:r>
     </w:p>
@@ -5474,7 +5493,14 @@
           <w:rFonts w:ascii="Times New Roman" w:hAnsi="Times New Roman" w:cs="Times New Roman"/>
           <w:lang w:val="en-US"/>
         </w:rPr>
-        <w:t>: ……………</w:t>
+        <w:t xml:space="preserve">: </w:t>
+      </w:r>
+      <w:r>
+        <w:rPr>
+          <w:rFonts w:ascii="Times New Roman" w:hAnsi="Times New Roman" w:cs="Times New Roman"/>
+          <w:lang w:val="en-US"/>
+        </w:rPr>
+        <w:t>{email}</w:t>
       </w:r>
     </w:p>
     <w:p>
@@ -7558,7 +7584,6 @@
                 <w:rFonts w:ascii="Times New Roman" w:hAnsi="Times New Roman" w:cs="Times New Roman"/>
                 <w:color w:val="auto"/>
               </w:rPr>
-              <w:lastRenderedPageBreak/>
               <w:t>9.8</w:t>
             </w:r>
           </w:p>
@@ -7666,6 +7691,7 @@
                 <w:rFonts w:ascii="Times New Roman" w:hAnsi="Times New Roman" w:cs="Times New Roman"/>
                 <w:color w:val="auto"/>
               </w:rPr>
+              <w:lastRenderedPageBreak/>
               <w:t>9.9</w:t>
             </w:r>
           </w:p>

</xml_diff>